<commit_message>
Update multiple language resources and regenerate all outputs for 2026-05-20 release
</commit_message>
<xml_diff>
--- a/eng/docx/008.content.docx
+++ b/eng/docx/008.content.docx
@@ -127,7 +127,7 @@
         <w:rPr>
           <w:lang w:val="en_US" w:bidi="en_US"/>
         </w:rPr>
-        <w:t>I</w:t>
+        <w:t>J</w:t>
       </w:r>
       <w:r>
         <w:rPr>
@@ -190,7 +190,7 @@
         <w:rPr>
           <w:lang w:val="en_US" w:bidi="en_US"/>
         </w:rPr>
-        <w:t>Iron Gate</w:t>
+        <w:t>Jordan River</w:t>
       </w:r>
       <w:r>
         <w:rPr>
@@ -225,7 +225,7 @@
         <w:rPr>
           <w:lang w:val="en_US" w:bidi="en_US"/>
         </w:rPr>
-        <w:t xml:space="preserve"> (59 seconds)</w:t>
+        <w:t xml:space="preserve"> (79 seconds)</w:t>
       </w:r>
     </w:p>
     <w:p>
@@ -272,6 +272,126 @@
         </w:rPr>
       </w:r>
       <w:hyperlink r:id="rId14">
+        <w:r>
+          <w:rPr>
+            <w:lang w:val="en_US" w:bidi="en_US"/>
+          </w:rPr>
+          <w:rPr>
+            <w:color w:val="0000EE"/>
+            <w:u w:val="single"/>
+          </w:rPr>
+          <w:t>link</w:t>
+        </w:r>
+      </w:hyperlink>
+      <w:r>
+        <w:rPr>
+          <w:lang w:val="en_US" w:bidi="en_US"/>
+        </w:rPr>
+      </w:r>
+      <w:r>
+        <w:rPr>
+          <w:lang w:val="en_US" w:bidi="en_US"/>
+        </w:rPr>
+      </w:r>
+    </w:p>
+    <w:p>
+      <w:pPr/>
+      <w:r>
+        <w:rPr>
+          <w:lang w:val="en_US" w:bidi="en_US"/>
+        </w:rPr>
+      </w:r>
+    </w:p>
+    <w:p>
+      <w:pPr>
+        <w:pStyle w:val="Heading2"/>
+      </w:pPr>
+      <w:r>
+        <w:rPr>
+          <w:lang w:val="en_US" w:bidi="en_US"/>
+        </w:rPr>
+        <w:t>Joseph's Coat</w:t>
+      </w:r>
+      <w:r>
+        <w:rPr>
+          <w:lang w:val="en_US" w:bidi="en_US"/>
+        </w:rPr>
+      </w:r>
+    </w:p>
+    <w:p>
+      <w:pPr>
+        <w:pStyle w:val="Heading4"/>
+      </w:pPr>
+      <w:r>
+        <w:rPr>
+          <w:lang w:val="en_US" w:bidi="en_US"/>
+        </w:rPr>
+        <w:t>Video Content</w:t>
+      </w:r>
+      <w:r>
+        <w:rPr>
+          <w:lang w:val="en_US" w:bidi="en_US"/>
+        </w:rPr>
+      </w:r>
+    </w:p>
+    <w:p>
+      <w:pPr/>
+      <w:r>
+        <w:rPr>
+          <w:lang w:val="en_US" w:bidi="en_US"/>
+        </w:rPr>
+      </w:r>
+      <w:r>
+        <w:rPr>
+          <w:lang w:val="en_US" w:bidi="en_US"/>
+        </w:rPr>
+        <w:t xml:space="preserve"> (88 seconds)</w:t>
+      </w:r>
+    </w:p>
+    <w:p>
+      <w:r>
+        <w:drawing>
+          <wp:inline xmlns:a="http://schemas.openxmlformats.org/drawingml/2006/main" xmlns:pic="http://schemas.openxmlformats.org/drawingml/2006/picture">
+            <wp:extent cx="6096000" cy="3429000"/>
+            <wp:docPr id="2" name="Picture 2"/>
+            <wp:cNvGraphicFramePr>
+              <a:graphicFrameLocks noChangeAspect="1"/>
+            </wp:cNvGraphicFramePr>
+            <a:graphic>
+              <a:graphicData uri="http://schemas.openxmlformats.org/drawingml/2006/picture">
+                <pic:pic>
+                  <pic:nvPicPr>
+                    <pic:cNvPr id="0" name="image.jpg"/>
+                    <pic:cNvPicPr/>
+                  </pic:nvPicPr>
+                  <pic:blipFill>
+                    <a:blip r:embed="rId15"/>
+                    <a:stretch>
+                      <a:fillRect/>
+                    </a:stretch>
+                  </pic:blipFill>
+                  <pic:spPr>
+                    <a:xfrm>
+                      <a:off x="0" y="0"/>
+                      <a:ext cx="6096000" cy="3429000"/>
+                    </a:xfrm>
+                    <a:prstGeom prst="rect"/>
+                  </pic:spPr>
+                </pic:pic>
+              </a:graphicData>
+            </a:graphic>
+          </wp:inline>
+        </w:drawing>
+      </w:r>
+    </w:p>
+    <w:p>
+      <w:pPr/>
+      <w:r>
+        <w:rPr>
+          <w:lang w:val="en_US" w:bidi="en_US"/>
+        </w:rPr>
+      </w:r>
+      <w:hyperlink r:id="rId16">
         <w:r>
           <w:rPr>
             <w:lang w:val="en_US" w:bidi="en_US"/>

</xml_diff>